<commit_message>
docs: tighten week 3 report and show beauty cleaning rules inline
</commit_message>
<xml_diff>
--- a/docs/week_03/Week_03_Data_Cleaning_Pipeline.docx
+++ b/docs/week_03/Week_03_Data_Cleaning_Pipeline.docx
@@ -56,43 +56,7 @@
         <w:spacing w:after="100" w:line="253"/>
       </w:pPr>
       <w:r>
-        <w:t xml:space="preserve">The pipeline prepares 23,911,390 beauty reviews for safety complaint analysis.</w:t>
-      </w:r>
-    </w:p>
-    <w:p>
-      <w:pPr>
-        <w:widowControl/>
-        <w:spacing w:after="100" w:line="253"/>
-      </w:pPr>
-      <w:r>
-        <w:t xml:space="preserve">It retains 23,663,832 reviews after removing 247,558 repeated reviewer/product/title/body tuples.</w:t>
-      </w:r>
-    </w:p>
-    <w:p>
-      <w:pPr>
-        <w:widowControl/>
-        <w:spacing w:after="100" w:line="253"/>
-      </w:pPr>
-      <w:r>
-        <w:t xml:space="preserve">Reviewer-aware grouping preserves 80,721 independent reviews lost under the previous rule.</w:t>
-      </w:r>
-    </w:p>
-    <w:p>
-      <w:pPr>
-        <w:widowControl/>
-        <w:spacing w:after="100" w:line="253"/>
-      </w:pPr>
-      <w:r>
-        <w:t xml:space="preserve">Logged text transformations, numeric normalisation and sampled language agreement prepare measurable inputs for analysis.</w:t>
-      </w:r>
-    </w:p>
-    <w:p>
-      <w:pPr>
-        <w:widowControl/>
-        <w:spacing w:after="100" w:line="253"/>
-      </w:pPr>
-      <w:r>
-        <w:t xml:space="preserve">Synthetic tests, input fingerprints and aggregate evidence document the completed run.</w:t>
+        <w:t xml:space="preserve">The pipeline prepares beauty reviews for safety complaint analysis, removing exact copies from the same reviewer while retaining uncertain evidence for inspection. Text transformations, numeric normalisation and sampled language agreement produce documented analysis inputs.</w:t>
       </w:r>
     </w:p>
     <w:tbl>
@@ -553,7 +517,7 @@
         <w:spacing w:after="100" w:line="253"/>
       </w:pPr>
       <w:r>
-        <w:t xml:space="preserve">Sections 4 to 7 give the required step-by-step methods; Sections 8 and 9 explain tools and reproducibility. The earlier requests for ethical depth and explicit hypothesis links are answered in Sections 11 and 10.</w:t>
+        <w:t xml:space="preserve">Brief bodies and missing catalogue context remain substantial evidence gaps after cleaning.</w:t>
       </w:r>
     </w:p>
     <w:p>
@@ -1680,16 +1644,16 @@
         <w:spacing w:after="100" w:line="253"/>
       </w:pPr>
       <w:r>
-        <w:t xml:space="preserve">Result: Decoding changes 2,026,844 input rows; normalisation changes 5,015,148. The previous rule would remove 328,279 rows; 82,193 came from reviewers other than the first in their group. The new rule removes 247,558, preserving 80,721 independent representatives. Cross-reviewer wording flags 130,416 (0.55%); cross-product wording flags 2,810,872 (11.88%). Repeated keys form 207,189 groups, 2 with different content. Final language flags: 148,280 (0.63%) likely non-English; 3,172,078 (13.40%) unknown. Seed 42, English/non-English shares: likely_en 97.74%/2.26% (n=15,601); likely_non_en 0.10%/99.71% (n=2,078); unknown 55.67%/44.33% (n=2,321). Weighted likely_non_en precision 99.90%, recall 14.98%; 4 undetected. Seed 43, English/non-English shares: likely_en 98.74%/1.26% (n=14,808); likely_non_en 0.29%/99.67% (n=2,093); unknown 75.09%/24.91% (n=3,099). Weighted likely_non_en precision 99.71%, recall 17.77%; 2 undetected. Poor seed-42 agreement triggered one adjustment: non-ASCII threshold 0.5 to 0.7, English-cue ceiling 2 to 3, and likely_en cue minimum 1 to 2. Fresh seed 43 remeasured the adjusted rule; recall still falls below the gate, so the flag misses most reference non-English cases.</w:t>
-      </w:r>
-    </w:p>
-    <w:p>
-      <w:pPr>
-        <w:widowControl/>
-        <w:spacing w:after="100" w:line="253"/>
-      </w:pPr>
-      <w:r>
-        <w:t xml:space="preserve">In plain terms: Two people can independently write the same opinion. Preserve both and count one person's repeated copy once. Both language evaluations sample the same 21,991,100 eligible-review population using different seeds. Undetected reference outputs are excluded from precision and recall, with their counts preserved. The adjusted unknown class is predominantly English according to the reference, so unknown describes heuristic coverage rather than a non-English label.</w:t>
+        <w:t xml:space="preserve">Result: Decoding changes 2,026,844 input rows; normalisation changes 5,015,148. The old product/title/text rule would remove 328,279 rows, including 82,193 from reviewers other than the first in their group; requiring reviewer identity removes 247,558 and preserves 80,721 independent representatives. Cross-reviewer wording flags 130,416 (0.55%); cross-product wording flags 2,810,872 (11.88%). Repeated keys form 207,189 groups, 2 with different content. Final language flags: 148,280 (0.63%) likely non-English; 3,172,078 (13.40%) unknown. Seed 42, English/non-English shares: likely_en 97.74%/2.26% (n=15,601); likely_non_en 0.10%/99.71% (n=2,078); unknown 55.67%/44.33% (n=2,321). Weighted likely_non_en precision 99.90%, recall 14.98%; 4 undetected. Seed 43, English/non-English shares: likely_en 98.74%/1.26% (n=14,808); likely_non_en 0.29%/99.67% (n=2,093); unknown 75.09%/24.91% (n=3,099). Weighted likely_non_en precision 99.71%, recall 17.77%; 2 undetected. Both samples represent 21,991,100 eligible reviews; undetected reference outputs are excluded from precision and recall.</w:t>
+      </w:r>
+    </w:p>
+    <w:p>
+      <w:pPr>
+        <w:widowControl/>
+        <w:spacing w:after="100" w:line="253"/>
+      </w:pPr>
+      <w:r>
+        <w:t xml:space="preserve">In plain terms: Removal requires the same reviewer, product, title and text, so a genuine repeat purchase review with any changed word is kept; an identical re-post by the same person on the same product is treated as a double post, and comparing raw versus cleaned 1-to-5-star shares (11.881%/5.332%/7.176%/10.942%/64.669% versus 11.863%/5.333%/7.181%/10.948%/64.675%) shows each rating share changes by less than 0.02 percentage points. The likely_non_en flag is precise (99.71%) but misses most non-English text (recall 17.77%), so it is used only to exclude confidently non-English rows from an analysis subset; any language-sensitive analysis must run langdetect on its own subset, and a 200-review bilingual human check of the unknown class would confirm the error rates.</w:t>
       </w:r>
     </w:p>
     <w:p>
@@ -1718,7 +1682,130 @@
         <w:spacing w:after="100" w:line="253"/>
       </w:pPr>
       <w:r>
-        <w:t xml:space="preserve">Method: Preserve no, not, never, without and contracted negation. The synthetic encoding &amp;#34;no irritation&amp;#34; becomes readable quotation marks with no retained. Flag memory uses of recall and expiry near return or refund wording without rewriting sentences. Extract explicit ml, fl oz and g quantities from catalogue titles, convert fluid ounces to millilitres, and keep grams separate. Extract explicitly marked shades into a casefolded field while retaining the original catalogue title. The excerpt uses the same contextual patterns as src/cleaning.py.</w:t>
+        <w:t xml:space="preserve">Method: Preserve no, not, never, without and contracted negation. The synthetic encoding &amp;#34;no irritation&amp;#34; becomes readable quotation marks with no retained. Apply these case-insensitive patterns to the combined title and body without rewriting either; adjacent raw strings below form one regex.</w:t>
+      </w:r>
+    </w:p>
+    <w:p>
+      <w:pPr>
+        <w:keepNext/>
+        <w:widowControl/>
+        <w:spacing w:after="0" w:line="215"/>
+      </w:pPr>
+      <w:r>
+        <w:rPr>
+          <w:rFonts w:ascii="Consolas" w:cs="Consolas" w:eastAsia="Consolas" w:hAnsi="Consolas"/>
+          <w:sz w:val="17"/>
+          <w:szCs w:val="17"/>
+        </w:rPr>
+        <w:t xml:space="preserve">RECALL_FRIEND = (</w:t>
+      </w:r>
+    </w:p>
+    <w:p>
+      <w:pPr>
+        <w:keepNext/>
+        <w:widowControl/>
+        <w:spacing w:after="0" w:line="215"/>
+      </w:pPr>
+      <w:r>
+        <w:rPr>
+          <w:rFonts w:ascii="Consolas" w:cs="Consolas" w:eastAsia="Consolas" w:hAnsi="Consolas"/>
+          <w:sz w:val="17"/>
+          <w:szCs w:val="17"/>
+        </w:rPr>
+        <w:t xml:space="preserve">    r"(?i)\b(?:(?:i|we|can|cannot|can't|don't|not)\s+"</w:t>
+      </w:r>
+    </w:p>
+    <w:p>
+      <w:pPr>
+        <w:keepNext/>
+        <w:widowControl/>
+        <w:spacing w:after="0" w:line="215"/>
+      </w:pPr>
+      <w:r>
+        <w:rPr>
+          <w:rFonts w:ascii="Consolas" w:cs="Consolas" w:eastAsia="Consolas" w:hAnsi="Consolas"/>
+          <w:sz w:val="17"/>
+          <w:szCs w:val="17"/>
+        </w:rPr>
+        <w:t xml:space="preserve">    r"(?:can\s+|quite\s+|really\s+)?recall|recall(?:ed)?"</w:t>
+      </w:r>
+    </w:p>
+    <w:p>
+      <w:pPr>
+        <w:keepNext/>
+        <w:widowControl/>
+        <w:spacing w:after="0" w:line="215"/>
+      </w:pPr>
+      <w:r>
+        <w:rPr>
+          <w:rFonts w:ascii="Consolas" w:cs="Consolas" w:eastAsia="Consolas" w:hAnsi="Consolas"/>
+          <w:sz w:val="17"/>
+          <w:szCs w:val="17"/>
+        </w:rPr>
+        <w:t xml:space="preserve">    r"\s+(?:using|buying|having|when|the last))\b")</w:t>
+      </w:r>
+    </w:p>
+    <w:p>
+      <w:pPr>
+        <w:widowControl/>
+        <w:spacing w:after="100" w:line="253"/>
+      </w:pPr>
+      <w:r>
+        <w:t xml:space="preserve">RECALL_FRIEND marks memory contexts, including I recall, cannot recall and recalled buying; it flags ambiguity rather than proving the absence of a product recall.</w:t>
+      </w:r>
+    </w:p>
+    <w:p>
+      <w:pPr>
+        <w:keepNext/>
+        <w:widowControl/>
+        <w:spacing w:after="0" w:line="215"/>
+      </w:pPr>
+      <w:r>
+        <w:rPr>
+          <w:rFonts w:ascii="Consolas" w:cs="Consolas" w:eastAsia="Consolas" w:hAnsi="Consolas"/>
+          <w:sz w:val="17"/>
+          <w:szCs w:val="17"/>
+        </w:rPr>
+        <w:t xml:space="preserve">EXPIRED_FRIEND = (</w:t>
+      </w:r>
+    </w:p>
+    <w:p>
+      <w:pPr>
+        <w:keepNext/>
+        <w:widowControl/>
+        <w:spacing w:after="0" w:line="215"/>
+      </w:pPr>
+      <w:r>
+        <w:rPr>
+          <w:rFonts w:ascii="Consolas" w:cs="Consolas" w:eastAsia="Consolas" w:hAnsi="Consolas"/>
+          <w:sz w:val="17"/>
+          <w:szCs w:val="17"/>
+        </w:rPr>
+        <w:t xml:space="preserve">    r"(?i)\b(?:return|refund|returning)\b.{0,50}\bexpir(?:ed|es|y)\b"</w:t>
+      </w:r>
+    </w:p>
+    <w:p>
+      <w:pPr>
+        <w:keepNext/>
+        <w:widowControl/>
+        <w:spacing w:after="0" w:line="215"/>
+      </w:pPr>
+      <w:r>
+        <w:rPr>
+          <w:rFonts w:ascii="Consolas" w:cs="Consolas" w:eastAsia="Consolas" w:hAnsi="Consolas"/>
+          <w:sz w:val="17"/>
+          <w:szCs w:val="17"/>
+        </w:rPr>
+        <w:t xml:space="preserve">    r"|\bexpir(?:ed|es|y)\b.{0,50}\b(?:return|refund|returning)\b")</w:t>
+      </w:r>
+    </w:p>
+    <w:p>
+      <w:pPr>
+        <w:widowControl/>
+        <w:spacing w:after="100" w:line="253"/>
+      </w:pPr>
+      <w:r>
+        <w:t xml:space="preserve">EXPIRED_FRIEND marks expired, expires or expiry within 50 intervening non-newline characters of return, refund or returning, in either order.</w:t>
       </w:r>
     </w:p>
     <w:p>
@@ -1783,6 +1870,114 @@
     </w:p>
     <w:p>
       <w:pPr>
+        <w:keepNext/>
+        <w:widowControl/>
+        <w:spacing w:after="0" w:line="215"/>
+      </w:pPr>
+      <w:r>
+        <w:rPr>
+          <w:rFonts w:ascii="Consolas" w:cs="Consolas" w:eastAsia="Consolas" w:hAnsi="Consolas"/>
+          <w:sz w:val="17"/>
+          <w:szCs w:val="17"/>
+        </w:rPr>
+        <w:t xml:space="preserve">size = titles.str.extract(</w:t>
+      </w:r>
+    </w:p>
+    <w:p>
+      <w:pPr>
+        <w:keepNext/>
+        <w:widowControl/>
+        <w:spacing w:after="0" w:line="215"/>
+      </w:pPr>
+      <w:r>
+        <w:rPr>
+          <w:rFonts w:ascii="Consolas" w:cs="Consolas" w:eastAsia="Consolas" w:hAnsi="Consolas"/>
+          <w:sz w:val="17"/>
+          <w:szCs w:val="17"/>
+        </w:rPr>
+        <w:t xml:space="preserve">    r"(?i)\b(\d+(?:\.\d+)?)\s*"</w:t>
+      </w:r>
+    </w:p>
+    <w:p>
+      <w:pPr>
+        <w:keepNext/>
+        <w:widowControl/>
+        <w:spacing w:after="0" w:line="215"/>
+      </w:pPr>
+      <w:r>
+        <w:rPr>
+          <w:rFonts w:ascii="Consolas" w:cs="Consolas" w:eastAsia="Consolas" w:hAnsi="Consolas"/>
+          <w:sz w:val="17"/>
+          <w:szCs w:val="17"/>
+        </w:rPr>
+        <w:t xml:space="preserve">    r"(ml|millilit(?:er|re)s?|fl\.?\s*oz\.?|fluid ounces?|g|grams?)\b")</w:t>
+      </w:r>
+    </w:p>
+    <w:p>
+      <w:pPr>
+        <w:widowControl/>
+        <w:spacing w:after="100" w:line="253"/>
+      </w:pPr>
+      <w:r>
+        <w:t xml:space="preserve">The quantity regex keeps only the first supported number/unit match from left to right, even in bundles or titles containing both mass and volume; later matches are ignored. US fluid ounce = 29.5735295625 ml; only explicit fl oz or fluid ounce(s) matches are converted. Plain oz without fl denotes weight but is not matched, converted or stored as grams; a later supported quantity can therefore be selected. Millilitres populate quantity_ml directly, and grams populate quantity_g separately, without a mass-to-volume conversion.</w:t>
+      </w:r>
+    </w:p>
+    <w:p>
+      <w:pPr>
+        <w:keepNext/>
+        <w:widowControl/>
+        <w:spacing w:after="0" w:line="215"/>
+      </w:pPr>
+      <w:r>
+        <w:rPr>
+          <w:rFonts w:ascii="Consolas" w:cs="Consolas" w:eastAsia="Consolas" w:hAnsi="Consolas"/>
+          <w:sz w:val="17"/>
+          <w:szCs w:val="17"/>
+        </w:rPr>
+        <w:t xml:space="preserve">df["shade"] = titles.str.extract(</w:t>
+      </w:r>
+    </w:p>
+    <w:p>
+      <w:pPr>
+        <w:keepNext/>
+        <w:widowControl/>
+        <w:spacing w:after="0" w:line="215"/>
+      </w:pPr>
+      <w:r>
+        <w:rPr>
+          <w:rFonts w:ascii="Consolas" w:cs="Consolas" w:eastAsia="Consolas" w:hAnsi="Consolas"/>
+          <w:sz w:val="17"/>
+          <w:szCs w:val="17"/>
+        </w:rPr>
+        <w:t xml:space="preserve">    r"(?i)\bshade\s*[:#-]?\s*([\w]+(?:\s+[\w]+)?)",</w:t>
+      </w:r>
+    </w:p>
+    <w:p>
+      <w:pPr>
+        <w:keepNext/>
+        <w:widowControl/>
+        <w:spacing w:after="0" w:line="215"/>
+      </w:pPr>
+      <w:r>
+        <w:rPr>
+          <w:rFonts w:ascii="Consolas" w:cs="Consolas" w:eastAsia="Consolas" w:hAnsi="Consolas"/>
+          <w:sz w:val="17"/>
+          <w:szCs w:val="17"/>
+        </w:rPr>
+        <w:t xml:space="preserve">    expand=False).str.casefold()</w:t>
+      </w:r>
+    </w:p>
+    <w:p>
+      <w:pPr>
+        <w:widowControl/>
+        <w:spacing w:after="100" w:line="253"/>
+      </w:pPr>
+      <w:r>
+        <w:t xml:space="preserve">The shade rule finds the first shade marker with an optional colon, hash or hyphen, captures up to two following word tokens and casefolds those tokens; implicit colour names are not inferred. Quantity and shade extraction use decoded, NFC-normalised, whitespace-collapsed catalogue titles, with original titles retained for inspection.</w:t>
+      </w:r>
+    </w:p>
+    <w:p>
+      <w:pPr>
         <w:widowControl/>
         <w:spacing w:after="100" w:line="253"/>
       </w:pPr>
@@ -1796,7 +1991,7 @@
         <w:spacing w:after="100" w:line="253"/>
       </w:pPr>
       <w:r>
-        <w:t xml:space="preserve">In plain terms: Keep the meaning of a reassurance and distinguish remembering a purchase from announcing a recall. Product attributes support candidate matching: explicit volume can be compared after unit conversion, while a gram quantity stays a mass. Original titles remain available to inspect the extracted value in context.</w:t>
+        <w:t xml:space="preserve">In plain terms: Keep the meaning of a reassurance and distinguish remembering a purchase from announcing a recall. Product attributes support candidate matching: explicit volume can be compared after unit conversion, while a gram quantity stays a mass. Original titles remain available to inspect the extracted value in context. For the synthetic title Serum 1 fl oz / 50 ml, quantity_ml is 29.5735295625, not 50. Cream 2 oz / 50 g yields quantity_g of 50 because plain oz is skipped. Cream 2 oz alone leaves both quantity fields missing. These examples expose the first-match limit without inferring package totals, density or equivalence between products.</w:t>
       </w:r>
     </w:p>
     <w:p>
@@ -1816,16 +2011,7 @@
         <w:spacing w:after="100" w:line="253"/>
       </w:pPr>
       <w:r>
-        <w:t xml:space="preserve">pandas 3.0.3 provides chunked input, vectorised string operations, nullable columns, validated joins and UTC dates. NumPy 2.4.6 supplies log1p and numerical quantile conventions. Python's html and unicodedata handle entity decoding and NFC; regex operations identify narrow patterns. These tools fit plain DataFrame functions without introducing a cleaning framework.</w:t>
-      </w:r>
-    </w:p>
-    <w:p>
-      <w:pPr>
-        <w:widowControl/>
-        <w:spacing w:after="100" w:line="253"/>
-      </w:pPr>
-      <w:r>
-        <w:t xml:space="preserve">hashlib records input fingerprints and hmac creates keyed reviewer pseudonyms. pytest exercises synthetic records offline. pyarrow writes typed Parquet partitions; CSV gzip is the supported fallback. langdetect 1.0.9 evaluates only the validation sample, avoiding detector inference on the complete release. SQLite performs global grouping on disk, and matplotlib creates the aggregate figures.</w:t>
+        <w:t xml:space="preserve">Vectorised DataFrame functions keep the workflow local and inspectable. SQLite supports grouping across chunks on disk; matplotlib renders aggregate figures. CSV gzip provides an output fallback when pyarrow is unavailable.</w:t>
       </w:r>
     </w:p>
     <w:tbl>
@@ -2346,7 +2532,7 @@
                 <w:sz w:val="18"/>
                 <w:szCs w:val="18"/>
               </w:rPr>
-              <w:t xml:space="preserve">Seeded reference inference on 20,000 rows per evaluation</w:t>
+              <w:t xml:space="preserve">Seeded reference inference on the validation samples</w:t>
             </w:r>
           </w:p>
         </w:tc>
@@ -2358,7 +2544,7 @@
         <w:spacing w:after="100" w:line="253"/>
       </w:pPr>
       <w:r>
-        <w:t xml:space="preserve">The pseudo-code shows the real streaming input interface. Chunk-local grouping would miss distant repetitions, so a disk-backed audit fits global rules before writing final partitions. Exact integer frequency histograms recover quantiles without retaining all numeric values in RAM. Standard library components keep the workflow local, with no service or cleaning framework to configure.</w:t>
+        <w:t xml:space="preserve">The excerpt shows the streaming interface and initial transformations, not the complete pipeline. Chunk-local grouping would miss distant repetitions, so global rules are fitted before final partitions are written. Exact integer frequency histograms recover quantiles without retaining all numeric values in RAM.</w:t>
       </w:r>
     </w:p>
     <w:p>
@@ -4259,7 +4445,7 @@
         <w:spacing w:after="100" w:line="253"/>
       </w:pPr>
       <w:r>
-        <w:t xml:space="preserve">Affected counts changed text at decoding and normalisation, issue unions at flagging stages, and every transformed row at numeric scaling and pseudonymisation. Duplicates includes removed copies plus retained repetition flags. UTC counts out-of-window flags although all retained rows gain dates. Input-stage counts include rows later removed; final flag totals use retained rows. These meanings also apply to Figure 2.</w:t>
+        <w:t xml:space="preserve">Affected counts changed text at decoding and normalisation, issue unions at flagging stages, and every transformed row at numeric scaling and pseudonymisation. Duplicates includes removed copies plus retained repetition flags. UTC counts out-of-window flags although all retained rows gain dates. Input-stage counts include rows later removed; final flag totals use retained rows.</w:t>
       </w:r>
     </w:p>
     <w:p>
@@ -4307,16 +4493,16 @@
         <w:spacing w:after="100" w:line="253"/>
       </w:pPr>
       <w:r>
-        <w:t xml:space="preserve">The background run received a fresh process-only CLEANING_SALT. To reproduce identical pseudonyms, supply the same private secret; to reproduce aggregate rules, preserve input order, fingerprints and pinned requirements.txt. Sampling seeds are 42 and, only after adjustment, 43; the reference detector seed is 0. Original gzip files remain untouched, and existing cleaned output causes an error rather than an overwrite.</w:t>
-      </w:r>
-    </w:p>
-    <w:p>
-      <w:pPr>
-        <w:widowControl/>
-        <w:spacing w:after="100" w:line="253"/>
-      </w:pPr>
-      <w:r>
-        <w:t xml:space="preserve">Previous versus current removal counts are 328,279 and 247,558; retention rises by 80,721. The four input-stage logs match the previous run. Outlier flags fall from 83,780 to 23,333 for length, while the fitted bounds change from 0.114663/5.949123 to -0.148739/6.107163. The helpful cutoff remains 95, with 5 additional vote flags. Missing catalogue-field flags increase by 5,228. These changes reflect recomputed retained distributions and coverage. The new numeric stage transforms every retained row. cleaning_run_comparison.json preserves the complete previous and current aggregates before archive deletion.</w:t>
+        <w:t xml:space="preserve">A fresh salt is generated per run in CLEANING_SALT and is not stored, so pseudonyms are deliberately not reproducible across runs, preventing linkage of published outputs to accounts; all counts and aggregates are reproducible because they do not depend on it.</w:t>
+      </w:r>
+    </w:p>
+    <w:p>
+      <w:pPr>
+        <w:widowControl/>
+        <w:spacing w:after="100" w:line="253"/>
+      </w:pPr>
+      <w:r>
+        <w:t xml:space="preserve">Before the module command, set CLEANING_SALT to a fresh private secret of at least 32 characters. Preserve input order, fingerprints and pinned requirements.txt to reproduce aggregates. Sampling uses seeds 42 and 43, with reference detector seed 0. Original gzip files remain untouched, and existing cleaned output causes an error rather than an overwrite.</w:t>
       </w:r>
     </w:p>
     <w:p>
@@ -4370,7 +4556,7 @@
         <w:spacing w:after="100" w:line="253"/>
       </w:pPr>
       <w:r>
-        <w:t xml:space="preserve">The Week 3 notebook reads the saved evidence, displays validation and scaling parameters, and draws the same affected-share chart as Figure 2. Its updated cells are deliberately unexecuted for reviewer execution. Neither notebook displays nor report figures require access to individual review wording.</w:t>
+        <w:t xml:space="preserve">The Week 3 notebook reads saved evidence, displays validation and scaling parameters, and draws Figure 2 from aggregates without accessing individual review wording.</w:t>
       </w:r>
     </w:p>
     <w:p>
@@ -4424,7 +4610,7 @@
         <w:spacing w:after="100" w:line="253"/>
       </w:pPr>
       <w:r>
-        <w:t xml:space="preserve">Figure 2. Affected share of each step's input. Orange shows 247,558 removed exact copies; blue shows changed or flagged rows kept. Percentages describe overlapping operations, not complaint prevalence.</w:t>
+        <w:t xml:space="preserve">Figure 2. Affected share of each step's input. Orange shows removed exact copies; blue shows changed or flagged rows kept. Percentages describe overlapping operations, not complaint prevalence.</w:t>
       </w:r>
     </w:p>
     <w:p>
@@ -4665,7 +4851,7 @@
         <w:spacing w:after="100" w:line="253"/>
       </w:pPr>
       <w:r>
-        <w:t xml:space="preserve">The completed pipeline retains 23,663,832 of 23,911,390 reviews under explicit cleaning rules. Reviewer-aware grouping preserves independent accounts, and numeric features use saved full-retained parameters. Stratified reference checks document language agreement, while contextual text flags, UTC dates and catalogue fields support the hypothesis-linked analysis. Source code, tests and aggregate records keep the process reviewable and its limits explicit.</w:t>
+        <w:t xml:space="preserve">Reviewer-aware grouping preserves independent accounts, and numeric features use saved parameters. Language-sensitive analysis requires subset detection and human validation alongside contextual text flags, UTC dates and catalogue attributes. Source code, tests and aggregate records keep the process reviewable and its limits explicit.</w:t>
       </w:r>
     </w:p>
     <w:sectPr>

</xml_diff>

<commit_message>
docs: consolidate week 4 feature plan and refresh week 3 report
</commit_message>
<xml_diff>
--- a/docs/week_03/Week_03_Data_Cleaning_Pipeline.docx
+++ b/docs/week_03/Week_03_Data_Cleaning_Pipeline.docx
@@ -56,43 +56,7 @@
         <w:spacing w:after="100" w:line="253"/>
       </w:pPr>
       <w:r>
-        <w:t xml:space="preserve">The pipeline prepares 23,911,390 beauty reviews for safety complaint analysis.</w:t>
-      </w:r>
-    </w:p>
-    <w:p>
-      <w:pPr>
-        <w:widowControl/>
-        <w:spacing w:after="100" w:line="253"/>
-      </w:pPr>
-      <w:r>
-        <w:t xml:space="preserve">It retains 23,663,832 reviews after removing 247,558 repeated reviewer/product/title/body tuples.</w:t>
-      </w:r>
-    </w:p>
-    <w:p>
-      <w:pPr>
-        <w:widowControl/>
-        <w:spacing w:after="100" w:line="253"/>
-      </w:pPr>
-      <w:r>
-        <w:t xml:space="preserve">Reviewer-aware grouping preserves 80,721 independent reviews lost under the previous rule.</w:t>
-      </w:r>
-    </w:p>
-    <w:p>
-      <w:pPr>
-        <w:widowControl/>
-        <w:spacing w:after="100" w:line="253"/>
-      </w:pPr>
-      <w:r>
-        <w:t xml:space="preserve">Logged text transformations, numeric normalisation and sampled language agreement prepare measurable inputs for analysis.</w:t>
-      </w:r>
-    </w:p>
-    <w:p>
-      <w:pPr>
-        <w:widowControl/>
-        <w:spacing w:after="100" w:line="253"/>
-      </w:pPr>
-      <w:r>
-        <w:t xml:space="preserve">Synthetic tests, input fingerprints and aggregate evidence document the completed run.</w:t>
+        <w:t xml:space="preserve">The pipeline prepares beauty reviews for safety complaint analysis, removing exact copies from the same reviewer while retaining uncertain evidence for inspection. Text transformations, numeric normalisation and sampled language agreement produce documented analysis inputs.</w:t>
       </w:r>
     </w:p>
     <w:tbl>
@@ -553,7 +517,7 @@
         <w:spacing w:after="100" w:line="253"/>
       </w:pPr>
       <w:r>
-        <w:t xml:space="preserve">Sections 4 to 7 give the required step-by-step methods; Sections 8 and 9 explain tools and reproducibility. The earlier requests for ethical depth and explicit hypothesis links are answered in Sections 11 and 10.</w:t>
+        <w:t xml:space="preserve">Brief bodies and missing catalogue context remain substantial evidence gaps after cleaning.</w:t>
       </w:r>
     </w:p>
     <w:p>
@@ -1680,16 +1644,16 @@
         <w:spacing w:after="100" w:line="253"/>
       </w:pPr>
       <w:r>
-        <w:t xml:space="preserve">Result: Decoding changes 2,026,844 input rows; normalisation changes 5,015,148. The previous rule would remove 328,279 rows; 82,193 came from reviewers other than the first in their group. The new rule removes 247,558, preserving 80,721 independent representatives. Cross-reviewer wording flags 130,416 (0.55%); cross-product wording flags 2,810,872 (11.88%). Repeated keys form 207,189 groups, 2 with different content. Final language flags: 148,280 (0.63%) likely non-English; 3,172,078 (13.40%) unknown. Seed 42, English/non-English shares: likely_en 97.74%/2.26% (n=15,601); likely_non_en 0.10%/99.71% (n=2,078); unknown 55.67%/44.33% (n=2,321). Weighted likely_non_en precision 99.90%, recall 14.98%; 4 undetected. Seed 43, English/non-English shares: likely_en 98.74%/1.26% (n=14,808); likely_non_en 0.29%/99.67% (n=2,093); unknown 75.09%/24.91% (n=3,099). Weighted likely_non_en precision 99.71%, recall 17.77%; 2 undetected. Poor seed-42 agreement triggered one adjustment: non-ASCII threshold 0.5 to 0.7, English-cue ceiling 2 to 3, and likely_en cue minimum 1 to 2. Fresh seed 43 remeasured the adjusted rule; recall still falls below the gate, so the flag misses most reference non-English cases.</w:t>
-      </w:r>
-    </w:p>
-    <w:p>
-      <w:pPr>
-        <w:widowControl/>
-        <w:spacing w:after="100" w:line="253"/>
-      </w:pPr>
-      <w:r>
-        <w:t xml:space="preserve">In plain terms: Two people can independently write the same opinion. Preserve both and count one person's repeated copy once. Both language evaluations sample the same 21,991,100 eligible-review population using different seeds. Undetected reference outputs are excluded from precision and recall, with their counts preserved. The adjusted unknown class is predominantly English according to the reference, so unknown describes heuristic coverage rather than a non-English label.</w:t>
+        <w:t xml:space="preserve">Result: Decoding changes 2,026,844 input rows; normalisation changes 5,015,148. The old product/title/text rule would remove 328,279 rows, including 82,193 from reviewers other than the first in their group; requiring reviewer identity removes 247,558 and preserves 80,721 independent representatives. Cross-reviewer wording flags 130,416 (0.55%); cross-product wording flags 2,810,872 (11.88%). Repeated keys form 207,189 groups, 2 with different content. Final language flags: 148,280 (0.63%) likely non-English; 3,172,078 (13.40%) unknown. Seed 42, English/non-English shares: likely_en 97.74%/2.26% (n=15,601); likely_non_en 0.10%/99.71% (n=2,078); unknown 55.67%/44.33% (n=2,321). Weighted likely_non_en precision 99.90%, recall 14.98%; 4 undetected. Seed 43, English/non-English shares: likely_en 98.74%/1.26% (n=14,808); likely_non_en 0.29%/99.67% (n=2,093); unknown 75.09%/24.91% (n=3,099). Weighted likely_non_en precision 99.71%, recall 17.77%; 2 undetected. Both samples represent 21,991,100 eligible reviews; undetected reference outputs are excluded from precision and recall.</w:t>
+      </w:r>
+    </w:p>
+    <w:p>
+      <w:pPr>
+        <w:widowControl/>
+        <w:spacing w:after="100" w:line="253"/>
+      </w:pPr>
+      <w:r>
+        <w:t xml:space="preserve">In plain terms: Removal requires the same reviewer, product, title and text, so a genuine repeat purchase review with any changed word is kept; an identical re-post by the same person on the same product is treated as a double post, and comparing raw versus cleaned 1-to-5-star shares (11.881%/5.332%/7.176%/10.942%/64.669% versus 11.863%/5.333%/7.181%/10.948%/64.675%) shows each rating share changes by less than 0.02 percentage points. The likely_non_en flag is precise (99.71%) but misses most non-English text (recall 17.77%), so it is used only to exclude confidently non-English rows from an analysis subset; any language-sensitive analysis must run langdetect on its own subset, and a 200-review bilingual human check of the unknown class would confirm the error rates.</w:t>
       </w:r>
     </w:p>
     <w:p>
@@ -1718,7 +1682,130 @@
         <w:spacing w:after="100" w:line="253"/>
       </w:pPr>
       <w:r>
-        <w:t xml:space="preserve">Method: Preserve no, not, never, without and contracted negation. The synthetic encoding &amp;#34;no irritation&amp;#34; becomes readable quotation marks with no retained. Flag memory uses of recall and expiry near return or refund wording without rewriting sentences. Extract explicit ml, fl oz and g quantities from catalogue titles, convert fluid ounces to millilitres, and keep grams separate. Extract explicitly marked shades into a casefolded field while retaining the original catalogue title. The excerpt uses the same contextual patterns as src/cleaning.py.</w:t>
+        <w:t xml:space="preserve">Method: Preserve no, not, never, without and contracted negation. The synthetic encoding &amp;#34;no irritation&amp;#34; becomes readable quotation marks with no retained. Apply these case-insensitive patterns to the combined title and body without rewriting either; adjacent raw strings below form one regex.</w:t>
+      </w:r>
+    </w:p>
+    <w:p>
+      <w:pPr>
+        <w:keepNext/>
+        <w:widowControl/>
+        <w:spacing w:after="0" w:line="215"/>
+      </w:pPr>
+      <w:r>
+        <w:rPr>
+          <w:rFonts w:ascii="Consolas" w:cs="Consolas" w:eastAsia="Consolas" w:hAnsi="Consolas"/>
+          <w:sz w:val="17"/>
+          <w:szCs w:val="17"/>
+        </w:rPr>
+        <w:t xml:space="preserve">RECALL_FRIEND = (</w:t>
+      </w:r>
+    </w:p>
+    <w:p>
+      <w:pPr>
+        <w:keepNext/>
+        <w:widowControl/>
+        <w:spacing w:after="0" w:line="215"/>
+      </w:pPr>
+      <w:r>
+        <w:rPr>
+          <w:rFonts w:ascii="Consolas" w:cs="Consolas" w:eastAsia="Consolas" w:hAnsi="Consolas"/>
+          <w:sz w:val="17"/>
+          <w:szCs w:val="17"/>
+        </w:rPr>
+        <w:t xml:space="preserve">    r"(?i)\b(?:(?:i|we|can|cannot|can't|don't|not)\s+"</w:t>
+      </w:r>
+    </w:p>
+    <w:p>
+      <w:pPr>
+        <w:keepNext/>
+        <w:widowControl/>
+        <w:spacing w:after="0" w:line="215"/>
+      </w:pPr>
+      <w:r>
+        <w:rPr>
+          <w:rFonts w:ascii="Consolas" w:cs="Consolas" w:eastAsia="Consolas" w:hAnsi="Consolas"/>
+          <w:sz w:val="17"/>
+          <w:szCs w:val="17"/>
+        </w:rPr>
+        <w:t xml:space="preserve">    r"(?:can\s+|quite\s+|really\s+)?recall|recall(?:ed)?"</w:t>
+      </w:r>
+    </w:p>
+    <w:p>
+      <w:pPr>
+        <w:keepNext/>
+        <w:widowControl/>
+        <w:spacing w:after="0" w:line="215"/>
+      </w:pPr>
+      <w:r>
+        <w:rPr>
+          <w:rFonts w:ascii="Consolas" w:cs="Consolas" w:eastAsia="Consolas" w:hAnsi="Consolas"/>
+          <w:sz w:val="17"/>
+          <w:szCs w:val="17"/>
+        </w:rPr>
+        <w:t xml:space="preserve">    r"\s+(?:using|buying|having|when|the last))\b")</w:t>
+      </w:r>
+    </w:p>
+    <w:p>
+      <w:pPr>
+        <w:widowControl/>
+        <w:spacing w:after="100" w:line="253"/>
+      </w:pPr>
+      <w:r>
+        <w:t xml:space="preserve">RECALL_FRIEND marks memory contexts, including I recall, cannot recall and recalled buying; it flags ambiguity rather than proving the absence of a product recall.</w:t>
+      </w:r>
+    </w:p>
+    <w:p>
+      <w:pPr>
+        <w:keepNext/>
+        <w:widowControl/>
+        <w:spacing w:after="0" w:line="215"/>
+      </w:pPr>
+      <w:r>
+        <w:rPr>
+          <w:rFonts w:ascii="Consolas" w:cs="Consolas" w:eastAsia="Consolas" w:hAnsi="Consolas"/>
+          <w:sz w:val="17"/>
+          <w:szCs w:val="17"/>
+        </w:rPr>
+        <w:t xml:space="preserve">EXPIRED_FRIEND = (</w:t>
+      </w:r>
+    </w:p>
+    <w:p>
+      <w:pPr>
+        <w:keepNext/>
+        <w:widowControl/>
+        <w:spacing w:after="0" w:line="215"/>
+      </w:pPr>
+      <w:r>
+        <w:rPr>
+          <w:rFonts w:ascii="Consolas" w:cs="Consolas" w:eastAsia="Consolas" w:hAnsi="Consolas"/>
+          <w:sz w:val="17"/>
+          <w:szCs w:val="17"/>
+        </w:rPr>
+        <w:t xml:space="preserve">    r"(?i)\b(?:return|refund|returning)\b.{0,50}\bexpir(?:ed|es|y)\b"</w:t>
+      </w:r>
+    </w:p>
+    <w:p>
+      <w:pPr>
+        <w:keepNext/>
+        <w:widowControl/>
+        <w:spacing w:after="0" w:line="215"/>
+      </w:pPr>
+      <w:r>
+        <w:rPr>
+          <w:rFonts w:ascii="Consolas" w:cs="Consolas" w:eastAsia="Consolas" w:hAnsi="Consolas"/>
+          <w:sz w:val="17"/>
+          <w:szCs w:val="17"/>
+        </w:rPr>
+        <w:t xml:space="preserve">    r"|\bexpir(?:ed|es|y)\b.{0,50}\b(?:return|refund|returning)\b")</w:t>
+      </w:r>
+    </w:p>
+    <w:p>
+      <w:pPr>
+        <w:widowControl/>
+        <w:spacing w:after="100" w:line="253"/>
+      </w:pPr>
+      <w:r>
+        <w:t xml:space="preserve">EXPIRED_FRIEND marks expired, expires or expiry within 50 intervening non-newline characters of return, refund or returning, in either order.</w:t>
       </w:r>
     </w:p>
     <w:p>
@@ -1783,6 +1870,114 @@
     </w:p>
     <w:p>
       <w:pPr>
+        <w:keepNext/>
+        <w:widowControl/>
+        <w:spacing w:after="0" w:line="215"/>
+      </w:pPr>
+      <w:r>
+        <w:rPr>
+          <w:rFonts w:ascii="Consolas" w:cs="Consolas" w:eastAsia="Consolas" w:hAnsi="Consolas"/>
+          <w:sz w:val="17"/>
+          <w:szCs w:val="17"/>
+        </w:rPr>
+        <w:t xml:space="preserve">size = titles.str.extract(</w:t>
+      </w:r>
+    </w:p>
+    <w:p>
+      <w:pPr>
+        <w:keepNext/>
+        <w:widowControl/>
+        <w:spacing w:after="0" w:line="215"/>
+      </w:pPr>
+      <w:r>
+        <w:rPr>
+          <w:rFonts w:ascii="Consolas" w:cs="Consolas" w:eastAsia="Consolas" w:hAnsi="Consolas"/>
+          <w:sz w:val="17"/>
+          <w:szCs w:val="17"/>
+        </w:rPr>
+        <w:t xml:space="preserve">    r"(?i)\b(\d+(?:\.\d+)?)\s*"</w:t>
+      </w:r>
+    </w:p>
+    <w:p>
+      <w:pPr>
+        <w:keepNext/>
+        <w:widowControl/>
+        <w:spacing w:after="0" w:line="215"/>
+      </w:pPr>
+      <w:r>
+        <w:rPr>
+          <w:rFonts w:ascii="Consolas" w:cs="Consolas" w:eastAsia="Consolas" w:hAnsi="Consolas"/>
+          <w:sz w:val="17"/>
+          <w:szCs w:val="17"/>
+        </w:rPr>
+        <w:t xml:space="preserve">    r"(ml|millilit(?:er|re)s?|fl\.?\s*oz\.?|fluid ounces?|g|grams?)\b")</w:t>
+      </w:r>
+    </w:p>
+    <w:p>
+      <w:pPr>
+        <w:widowControl/>
+        <w:spacing w:after="100" w:line="253"/>
+      </w:pPr>
+      <w:r>
+        <w:t xml:space="preserve">The quantity regex keeps only the first supported number/unit match from left to right, even in bundles or titles containing both mass and volume; later matches are ignored. US fluid ounce = 29.5735295625 ml; only explicit fl oz or fluid ounce(s) matches are converted. Plain oz without fl denotes weight but is not matched, converted or stored as grams; a later supported quantity can therefore be selected. Millilitres populate quantity_ml directly, and grams populate quantity_g separately, without a mass-to-volume conversion.</w:t>
+      </w:r>
+    </w:p>
+    <w:p>
+      <w:pPr>
+        <w:keepNext/>
+        <w:widowControl/>
+        <w:spacing w:after="0" w:line="215"/>
+      </w:pPr>
+      <w:r>
+        <w:rPr>
+          <w:rFonts w:ascii="Consolas" w:cs="Consolas" w:eastAsia="Consolas" w:hAnsi="Consolas"/>
+          <w:sz w:val="17"/>
+          <w:szCs w:val="17"/>
+        </w:rPr>
+        <w:t xml:space="preserve">df["shade"] = titles.str.extract(</w:t>
+      </w:r>
+    </w:p>
+    <w:p>
+      <w:pPr>
+        <w:keepNext/>
+        <w:widowControl/>
+        <w:spacing w:after="0" w:line="215"/>
+      </w:pPr>
+      <w:r>
+        <w:rPr>
+          <w:rFonts w:ascii="Consolas" w:cs="Consolas" w:eastAsia="Consolas" w:hAnsi="Consolas"/>
+          <w:sz w:val="17"/>
+          <w:szCs w:val="17"/>
+        </w:rPr>
+        <w:t xml:space="preserve">    r"(?i)\bshade\s*[:#-]?\s*([\w]+(?:\s+[\w]+)?)",</w:t>
+      </w:r>
+    </w:p>
+    <w:p>
+      <w:pPr>
+        <w:keepNext/>
+        <w:widowControl/>
+        <w:spacing w:after="0" w:line="215"/>
+      </w:pPr>
+      <w:r>
+        <w:rPr>
+          <w:rFonts w:ascii="Consolas" w:cs="Consolas" w:eastAsia="Consolas" w:hAnsi="Consolas"/>
+          <w:sz w:val="17"/>
+          <w:szCs w:val="17"/>
+        </w:rPr>
+        <w:t xml:space="preserve">    expand=False).str.casefold()</w:t>
+      </w:r>
+    </w:p>
+    <w:p>
+      <w:pPr>
+        <w:widowControl/>
+        <w:spacing w:after="100" w:line="253"/>
+      </w:pPr>
+      <w:r>
+        <w:t xml:space="preserve">The shade rule finds the first shade marker with an optional colon, hash or hyphen, captures up to two following word tokens and casefolds those tokens; implicit colour names are not inferred. Quantity and shade extraction use decoded, NFC-normalised, whitespace-collapsed catalogue titles, with original titles retained for inspection.</w:t>
+      </w:r>
+    </w:p>
+    <w:p>
+      <w:pPr>
         <w:widowControl/>
         <w:spacing w:after="100" w:line="253"/>
       </w:pPr>
@@ -1796,7 +1991,7 @@
         <w:spacing w:after="100" w:line="253"/>
       </w:pPr>
       <w:r>
-        <w:t xml:space="preserve">In plain terms: Keep the meaning of a reassurance and distinguish remembering a purchase from announcing a recall. Product attributes support candidate matching: explicit volume can be compared after unit conversion, while a gram quantity stays a mass. Original titles remain available to inspect the extracted value in context.</w:t>
+        <w:t xml:space="preserve">In plain terms: Keep the meaning of a reassurance and distinguish remembering a purchase from announcing a recall. Product attributes support candidate matching: explicit volume can be compared after unit conversion, while a gram quantity stays a mass. Original titles remain available to inspect the extracted value in context. For the synthetic title Serum 1 fl oz / 50 ml, quantity_ml is 29.5735295625, not 50. Cream 2 oz / 50 g yields quantity_g of 50 because plain oz is skipped. Cream 2 oz alone leaves both quantity fields missing. These examples expose the first-match limit without inferring package totals, density or equivalence between products.</w:t>
       </w:r>
     </w:p>
     <w:p>
@@ -1816,16 +2011,7 @@
         <w:spacing w:after="100" w:line="253"/>
       </w:pPr>
       <w:r>
-        <w:t xml:space="preserve">pandas 3.0.3 provides chunked input, vectorised string operations, nullable columns, validated joins and UTC dates. NumPy 2.4.6 supplies log1p and numerical quantile conventions. Python's html and unicodedata handle entity decoding and NFC; regex operations identify narrow patterns. These tools fit plain DataFrame functions without introducing a cleaning framework.</w:t>
-      </w:r>
-    </w:p>
-    <w:p>
-      <w:pPr>
-        <w:widowControl/>
-        <w:spacing w:after="100" w:line="253"/>
-      </w:pPr>
-      <w:r>
-        <w:t xml:space="preserve">hashlib records input fingerprints and hmac creates keyed reviewer pseudonyms. pytest exercises synthetic records offline. pyarrow writes typed Parquet partitions; CSV gzip is the supported fallback. langdetect 1.0.9 evaluates only the validation sample, avoiding detector inference on the complete release. SQLite performs global grouping on disk, and matplotlib creates the aggregate figures.</w:t>
+        <w:t xml:space="preserve">Vectorised DataFrame functions keep the workflow local and inspectable. SQLite supports grouping across chunks on disk; matplotlib renders aggregate figures. CSV gzip provides an output fallback when pyarrow is unavailable.</w:t>
       </w:r>
     </w:p>
     <w:tbl>
@@ -2346,7 +2532,7 @@
                 <w:sz w:val="18"/>
                 <w:szCs w:val="18"/>
               </w:rPr>
-              <w:t xml:space="preserve">Seeded reference inference on 20,000 rows per evaluation</w:t>
+              <w:t xml:space="preserve">Seeded reference inference on the validation samples</w:t>
             </w:r>
           </w:p>
         </w:tc>
@@ -2358,7 +2544,7 @@
         <w:spacing w:after="100" w:line="253"/>
       </w:pPr>
       <w:r>
-        <w:t xml:space="preserve">The pseudo-code shows the real streaming input interface. Chunk-local grouping would miss distant repetitions, so a disk-backed audit fits global rules before writing final partitions. Exact integer frequency histograms recover quantiles without retaining all numeric values in RAM. Standard library components keep the workflow local, with no service or cleaning framework to configure.</w:t>
+        <w:t xml:space="preserve">The excerpt shows the streaming interface and initial transformations, not the complete pipeline. Chunk-local grouping would miss distant repetitions, so global rules are fitted before final partitions are written. Exact integer frequency histograms recover quantiles without retaining all numeric values in RAM.</w:t>
       </w:r>
     </w:p>
     <w:p>
@@ -4259,7 +4445,7 @@
         <w:spacing w:after="100" w:line="253"/>
       </w:pPr>
       <w:r>
-        <w:t xml:space="preserve">Affected counts changed text at decoding and normalisation, issue unions at flagging stages, and every transformed row at numeric scaling and pseudonymisation. Duplicates includes removed copies plus retained repetition flags. UTC counts out-of-window flags although all retained rows gain dates. Input-stage counts include rows later removed; final flag totals use retained rows. These meanings also apply to Figure 2.</w:t>
+        <w:t xml:space="preserve">Affected counts changed text at decoding and normalisation, issue unions at flagging stages, and every transformed row at numeric scaling and pseudonymisation. Duplicates includes removed copies plus retained repetition flags. UTC counts out-of-window flags although all retained rows gain dates. Input-stage counts include rows later removed; final flag totals use retained rows.</w:t>
       </w:r>
     </w:p>
     <w:p>
@@ -4307,16 +4493,16 @@
         <w:spacing w:after="100" w:line="253"/>
       </w:pPr>
       <w:r>
-        <w:t xml:space="preserve">The background run received a fresh process-only CLEANING_SALT. To reproduce identical pseudonyms, supply the same private secret; to reproduce aggregate rules, preserve input order, fingerprints and pinned requirements.txt. Sampling seeds are 42 and, only after adjustment, 43; the reference detector seed is 0. Original gzip files remain untouched, and existing cleaned output causes an error rather than an overwrite.</w:t>
-      </w:r>
-    </w:p>
-    <w:p>
-      <w:pPr>
-        <w:widowControl/>
-        <w:spacing w:after="100" w:line="253"/>
-      </w:pPr>
-      <w:r>
-        <w:t xml:space="preserve">Previous versus current removal counts are 328,279 and 247,558; retention rises by 80,721. The four input-stage logs match the previous run. Outlier flags fall from 83,780 to 23,333 for length, while the fitted bounds change from 0.114663/5.949123 to -0.148739/6.107163. The helpful cutoff remains 95, with 5 additional vote flags. Missing catalogue-field flags increase by 5,228. These changes reflect recomputed retained distributions and coverage. The new numeric stage transforms every retained row. cleaning_run_comparison.json preserves the complete previous and current aggregates before archive deletion.</w:t>
+        <w:t xml:space="preserve">A fresh salt is generated per run in CLEANING_SALT and is not stored, so pseudonyms are deliberately not reproducible across runs, preventing linkage of published outputs to accounts; all counts and aggregates are reproducible because they do not depend on it.</w:t>
+      </w:r>
+    </w:p>
+    <w:p>
+      <w:pPr>
+        <w:widowControl/>
+        <w:spacing w:after="100" w:line="253"/>
+      </w:pPr>
+      <w:r>
+        <w:t xml:space="preserve">Before the module command, set CLEANING_SALT to a fresh private secret of at least 32 characters. Preserve input order, fingerprints and pinned requirements.txt to reproduce aggregates. Sampling uses seeds 42 and 43, with reference detector seed 0. Original gzip files remain untouched, and existing cleaned output causes an error rather than an overwrite.</w:t>
       </w:r>
     </w:p>
     <w:p>
@@ -4370,7 +4556,7 @@
         <w:spacing w:after="100" w:line="253"/>
       </w:pPr>
       <w:r>
-        <w:t xml:space="preserve">The Week 3 notebook reads the saved evidence, displays validation and scaling parameters, and draws the same affected-share chart as Figure 2. Its updated cells are deliberately unexecuted for reviewer execution. Neither notebook displays nor report figures require access to individual review wording.</w:t>
+        <w:t xml:space="preserve">The Week 3 notebook reads saved evidence, displays validation and scaling parameters, and draws Figure 2 from aggregates without accessing individual review wording.</w:t>
       </w:r>
     </w:p>
     <w:p>
@@ -4424,7 +4610,7 @@
         <w:spacing w:after="100" w:line="253"/>
       </w:pPr>
       <w:r>
-        <w:t xml:space="preserve">Figure 2. Affected share of each step's input. Orange shows 247,558 removed exact copies; blue shows changed or flagged rows kept. Percentages describe overlapping operations, not complaint prevalence.</w:t>
+        <w:t xml:space="preserve">Figure 2. Affected share of each step's input. Orange shows removed exact copies; blue shows changed or flagged rows kept. Percentages describe overlapping operations, not complaint prevalence.</w:t>
       </w:r>
     </w:p>
     <w:p>
@@ -4665,7 +4851,7 @@
         <w:spacing w:after="100" w:line="253"/>
       </w:pPr>
       <w:r>
-        <w:t xml:space="preserve">The completed pipeline retains 23,663,832 of 23,911,390 reviews under explicit cleaning rules. Reviewer-aware grouping preserves independent accounts, and numeric features use saved full-retained parameters. Stratified reference checks document language agreement, while contextual text flags, UTC dates and catalogue fields support the hypothesis-linked analysis. Source code, tests and aggregate records keep the process reviewable and its limits explicit.</w:t>
+        <w:t xml:space="preserve">Reviewer-aware grouping preserves independent accounts, and numeric features use saved parameters. Language-sensitive analysis requires subset detection and human validation alongside contextual text flags, UTC dates and catalogue attributes. Source code, tests and aggregate records keep the process reviewable and its limits explicit.</w:t>
       </w:r>
     </w:p>
     <w:sectPr>

</xml_diff>